<commit_message>
Manuscript: fill resolved placeholders, add GitHub repository link
- Second backbone named: RNA-FM (99.5M params, 12 layers, 1280-dim; multimolecule/rnafm) in Methods 3.2, Results 4.8, Table 6 and Limitations
- Section 7: repository URL github.com/nimaone/rnalm-family-exposure, notebook renamed to CHANRG_Paper_Track_v7_DriveBacked.ipynb, dataset/repository note resolved, RNA-FM AGPL license noted
- References: added Chen et al. 2022 (RNA-FM, arXiv:2204.00300)
- md, docx (figures preserved) and PDF regenerated from corrected text
</commit_message>
<xml_diff>
--- a/manuscript/How much of an RNA language model's in-distribution advantage is family exposure A controlled decomposition on CHANRG.docx
+++ b/manuscript/How much of an RNA language model's in-distribution advantage is family exposure A controlled decomposition on CHANRG.docx
@@ -630,7 +630,7 @@
     <w:p>
       <w:pPr/>
       <w:r>
-        <w:t xml:space="preserve">Training: 3 epochs (36,000 updates at N = 12,000), mixed precision, one NVIDIA T4 GPU, seeds 0, 1, 2. The decision threshold is chosen on validation. A second frozen backbone [name to confirm] was run in the same way for the main comparison (b2+phys, three seeds).</w:t>
+        <w:t xml:space="preserve">Training: 3 epochs (36,000 updates at N = 12,000), mixed precision, one NVIDIA T4 GPU, seeds 0, 1, 2. The decision threshold is chosen on validation. A second frozen backbone, RNA-FM (99.5M parameters, 12 layers, 1280-dim embeddings; Chen et al., 2022), loaded through MultiMolecule in the same way, was run for the main comparison (b2+phys, three seeds).</w:t>
       </w:r>
     </w:p>
     <w:p>
@@ -2915,7 +2915,7 @@
           <w:p>
             <w:pPr/>
             <w:r>
-              <w:t xml:space="preserve">b2+phys (second backbone)</w:t>
+              <w:t xml:space="preserve">b2+phys (RNA-FM)</w:t>
             </w:r>
           </w:p>
         </w:tc>
@@ -2988,7 +2988,7 @@
     <w:p>
       <w:pPr/>
       <w:r>
-        <w:t xml:space="preserve">We repeated the main comparison with a second frozen backbone, [name, size and source to confirm], embedded the same way and paired with physics features (b2+phys, three seeds). Its Test macro-F1 was 0.488 and its mean OOD macro-F1 was 0.348, against 0.363 and 0.338 without an LM. The gain over no LM was +0.124 on Test (95% CI 0.037–0.190) and +0.010 OOD (−0.013 to 0.027); the ID–OOD interaction was +0.114 (0.027–0.181). By family-size tier the gain was −0.001 (&lt;10), +0.033 (10–49) and +0.203 (≥50; 0.087–0.260), and with equal weight per family it was +0.010 on Test (−0.004 to 0.023). The pattern matches RiNALMo (gain concentrated in large families, none OOD) but is weaker at every tier.</w:t>
+        <w:t xml:space="preserve">We repeated the main comparison with a second frozen backbone, RNA-FM (99.5M parameters, 1280-dim embeddings; Chen et al., 2022), embedded the same way and paired with physics features (b2+phys, three seeds). Its Test macro-F1 was 0.488 and its mean OOD macro-F1 was 0.348, against 0.363 and 0.338 without an LM. The gain over no LM was +0.124 on Test (95% CI 0.037–0.190) and +0.010 OOD (−0.013 to 0.027); the ID–OOD interaction was +0.114 (0.027–0.181). By family-size tier the gain was −0.001 (&lt;10), +0.033 (10–49) and +0.203 (≥50; 0.087–0.260), and with equal weight per family it was +0.010 on Test (−0.004 to 0.023). The pattern matches RiNALMo — the gain is concentrated in the large families and absent out of distribution — but is weaker at every tier.</w:t>
       </w:r>
     </w:p>
     <w:p>
@@ -3058,7 +3058,7 @@
         <w:t xml:space="preserve">Scope.</w:t>
       </w:r>
       <w:r>
-        <w:t xml:space="preserve"> Two backbones (RiNALMo-giga in every analysis, a second one in the main comparison only), one dataset (CHANRG), frozen embeddings, and a small decoder. Results may differ for other models and for full fine-tuning.</w:t>
+        <w:t xml:space="preserve"> Two backbones (RiNALMo-giga in every analysis, RNA-FM in the main comparison only), one dataset (CHANRG), frozen embeddings, and a small decoder. Results may differ for other models and for full fine-tuning.</w:t>
       </w:r>
     </w:p>
     <w:p>
@@ -3180,7 +3180,7 @@
     <w:p>
       <w:pPr/>
       <w:r>
-        <w:t xml:space="preserve">The analysis notebook (v6), the per-sequence count files (npz) and the analysis JSON files will be deposited at GitHub (github.com/nimaone/[repository name to add]) with a Zenodo archive [DOI to add]. CHANRG and RiNALMo are third-party resources. The MultiMolecule CHANRG dataset card lists AGPL-3.0-or-later and the CHANRG paper is CC BY-NC-SA 4.0 [confirm which repository was used and check what may be redistributed; we suggest sharing only per-sequence results and counts, not the data]. RiNALMo code is Apache-2.0 and its weights are CC BY 4.0 (Zenodo record 15043668). The backbone was loaded through MultiMolecule (Chen and Zhu, 2024).</w:t>
+        <w:t xml:space="preserve">The pipeline notebook (CHANRG_Paper_Track_v7_DriveBacked.ipynb), the analysis JSON files, the final report tables and the per-stage run logs are available at github.com/nimaone/rnalm-family-exposure; a Zenodo archive with a DOI will follow [DOI to add]. CHANRG and RiNALMo are third-party resources. We used the multimolecule/chanrg Hugging Face repository; its dataset card lists AGPL-3.0-or-later and the CHANRG paper is CC BY-NC-SA 4.0, so no dataset content is redistributed here. RiNALMo code is Apache-2.0 and its weights are CC BY 4.0 (Zenodo record 15043668). The RNA-FM checkpoint is AGPL-3.0-or-later. Both backbones were loaded through MultiMolecule (Chen and Zhu, 2024).</w:t>
       </w:r>
     </w:p>
     <w:p>
@@ -3336,6 +3336,18 @@
       </w:hyperlink>
       <w:r>
         <w:t xml:space="preserve">.</w:t>
+      </w:r>
+    </w:p>
+    <w:p>
+      <w:pPr>
+        <w:pStyle w:val="ListParagraph"/>
+        <w:numPr>
+          <w:ilvl w:val="0"/>
+          <w:numId w:val="6"/>
+        </w:numPr>
+      </w:pPr>
+      <w:r>
+        <w:t xml:space="preserve">Chen, J., Hu, Z., Sun, S., Tan, Q., Wang, Y., Yu, Q., Zong, L., Hong, L., Xiao, J., King, I., et al. (2022). Interpretable RNA foundation model from unannotated data for highly accurate RNA structure and function predictions. arXiv:2204.00300.</w:t>
       </w:r>
     </w:p>
     <w:p>

</xml_diff>

<commit_message>
Add AI-tool and competing-interests statements; finalize references
- Competing interests: none declared. AI disclosure: Claude (Anthropic) used
  for code development and drafting/editing, author reviewed and is responsible
- RiNALMo: author list confirmed (Penić, Vlašić, Huber, Wan, Šikić), tag removed
- Szikszai et al. 2022: full authors, Bioinformatics 38(16) 3892-3899, doi:10.1093/bioinformatics/btac415
- Zablocki et al.: correct title 'Comprehensive benchmarking of large language models...'
- MultiMolecule: correct authors Chen, Z. and Zhu, S. Y.
</commit_message>
<xml_diff>
--- a/manuscript/How much of an RNA language model's in-distribution advantage is family exposure A controlled decomposition on CHANRG.docx
+++ b/manuscript/How much of an RNA language model's in-distribution advantage is family exposure A controlled decomposition on CHANRG.docx
@@ -3189,10 +3189,22 @@
         <w:rPr>
           <w:b/>
         </w:rPr>
-        <w:t xml:space="preserve">Competing interests / AI-tool disclosure.</w:t>
-      </w:r>
-      <w:r>
-        <w:t xml:space="preserve"> [Complete according to the policy of the chosen platform.]</w:t>
+        <w:t xml:space="preserve">Competing interests.</w:t>
+      </w:r>
+      <w:r>
+        <w:t xml:space="preserve"> The author declares no competing interests.</w:t>
+      </w:r>
+    </w:p>
+    <w:p>
+      <w:pPr/>
+      <w:r>
+        <w:rPr>
+          <w:b/>
+        </w:rPr>
+        <w:t xml:space="preserve">Use of AI tools.</w:t>
+      </w:r>
+      <w:r>
+        <w:t xml:space="preserve"> In preparing this manuscript, the author used an AI assistant (Claude, Anthropic) for developing the analysis code and for drafting and editing the text. All AI-assisted content was reviewed and edited by the author, who approved the final manuscript and takes full responsibility for its content and for the integrity of the reported results.</w:t>
       </w:r>
     </w:p>
     <w:p>
@@ -3232,7 +3244,7 @@
         </w:r>
       </w:hyperlink>
       <w:r>
-        <w:t xml:space="preserve"> [full author list to confirm]</w:t>
+        <w:t xml:space="preserve">.</w:t>
       </w:r>
     </w:p>
     <w:p>
@@ -3267,29 +3279,18 @@
         </w:numPr>
       </w:pPr>
       <w:r>
-        <w:t xml:space="preserve">Szikszai, M. et al. (2022). Deep learning models for RNA secondary structure prediction (probably) do not generalize across families. </w:t>
-      </w:r>
-      <w:hyperlink r:id="rId11" w:history="1">
+        <w:t xml:space="preserve">Szikszai, M., Wise, M., Datta, A., Ward, M., Mathews, D. H. (2022). Deep learning models for RNA secondary structure prediction (probably) do not generalize across families. Bioinformatics 38(16), 3892–3899. </w:t>
+      </w:r>
+      <w:hyperlink r:id="rId100" w:history="1">
         <w:r>
           <w:rPr>
             <w:rStyle w:val="Hyperlink"/>
           </w:rPr>
-          <w:t xml:space="preserve">bioRxiv 10.1101/2022.03.21.485135</w:t>
+          <w:t xml:space="preserve">doi:10.1093/bioinformatics/btac415</w:t>
         </w:r>
       </w:hyperlink>
       <w:r>
-        <w:t xml:space="preserve">; journal version </w:t>
-      </w:r>
-      <w:hyperlink r:id="rId12" w:history="1">
-        <w:r>
-          <w:rPr>
-            <w:rStyle w:val="Hyperlink"/>
-          </w:rPr>
-          <w:t xml:space="preserve">PubMed 35748706</w:t>
-        </w:r>
-      </w:hyperlink>
-      <w:r>
-        <w:t xml:space="preserve"> [authors, journal and pages to confirm].</w:t>
+        <w:t xml:space="preserve">.</w:t>
       </w:r>
     </w:p>
     <w:p>
@@ -3301,7 +3302,7 @@
         </w:numPr>
       </w:pPr>
       <w:r>
-        <w:t xml:space="preserve">Zablocki, L. I., Bugnon, L. A., Gerard, M., Di Persia, L., Stegmayer, G., Milone, D. H. (2024; v2 2025). Benchmark of pretrained RNA language models for RNA secondary structure prediction. </w:t>
+        <w:t xml:space="preserve">Zablocki, L. I., Bugnon, L. A., Gerard, M., Di Persia, L., Stegmayer, G., Milone, D. H. (2024; v2 2025). Comprehensive benchmarking of large language models for RNA secondary structure prediction. </w:t>
       </w:r>
       <w:hyperlink r:id="rId13" w:history="1">
         <w:r>
@@ -3312,7 +3313,7 @@
         </w:r>
       </w:hyperlink>
       <w:r>
-        <w:t xml:space="preserve"> [exact title to confirm].</w:t>
+        <w:t xml:space="preserve">.</w:t>
       </w:r>
     </w:p>
     <w:p>
@@ -3359,7 +3360,7 @@
         </w:numPr>
       </w:pPr>
       <w:r>
-        <w:t xml:space="preserve">Chen, Z., Zhu, T. (2024). MultiMolecule. Zenodo. doi:10.5281/zenodo.12638419 [author list to confirm].</w:t>
+        <w:t xml:space="preserve">Chen, Z., Zhu, S. Y. (2024). MultiMolecule. Zenodo. doi:10.5281/zenodo.12638419.</w:t>
       </w:r>
     </w:p>
     <w:sectPr>

</xml_diff>

<commit_message>
Remove leftover '@nima' metadata line from title block
</commit_message>
<xml_diff>
--- a/manuscript/How much of an RNA language model's in-distribution advantage is family exposure A controlled decomposition on CHANRG.docx
+++ b/manuscript/How much of an RNA language model's in-distribution advantage is family exposure A controlled decomposition on CHANRG.docx
@@ -14,12 +14,6 @@
       <w:pPr/>
       <w:r>
         <w:t xml:space="preserve">Oct 15, 2026</w:t>
-      </w:r>
-      <w:r>
-        <w:t xml:space="preserve"> · </w:t>
-      </w:r>
-      <w:r>
-        <w:t xml:space="preserve">@nima</w:t>
       </w:r>
     </w:p>
     <w:p>

</xml_diff>